<commit_message>
Specs operativas completas (11 paquetes + constitución)
</commit_message>
<xml_diff>
--- a/diagramas/VinAnalytics_Documentacion.docx
+++ b/diagramas/VinAnalytics_Documentacion.docx
@@ -133,12 +133,20 @@
       <w:r>
         <w:rPr>
           <w:rFonts w:ascii="Times New Roman" w:hAnsi="Times New Roman" w:cs="Times New Roman"/>
-          <w:b/>
-          <w:sz w:val="28"/>
-          <w:lang w:val="es-ES"/>
-        </w:rPr>
-        <w:t>DOCUMENTACIÓN ESTRATÉGICA DEL SISTEMA</w:t>
-      </w:r>
+          <w:lang w:val="es-ES"/>
+        </w:rPr>
+        <w:t xml:space="preserve">Link del video: </w:t>
+      </w:r>
+      <w:hyperlink r:id="rId6" w:history="1">
+        <w:r>
+          <w:rPr>
+            <w:rStyle w:val="Hipervnculo"/>
+            <w:rFonts w:ascii="Times New Roman" w:hAnsi="Times New Roman" w:cs="Times New Roman"/>
+            <w:lang w:val="es-ES"/>
+          </w:rPr>
+          <w:t>https://youtu.be/FuwaYu_1OnQ?si=a0-vepYEYyzXY8lo</w:t>
+        </w:r>
+      </w:hyperlink>
     </w:p>
     <w:p>
       <w:pPr>
@@ -148,46 +156,6 @@
           <w:lang w:val="es-ES"/>
         </w:rPr>
       </w:pPr>
-      <w:r>
-        <w:rPr>
-          <w:rFonts w:ascii="Times New Roman" w:hAnsi="Times New Roman" w:cs="Times New Roman"/>
-          <w:i/>
-          <w:lang w:val="es-ES"/>
-        </w:rPr>
-        <w:t>Los Datos como Activo Estratégico para la Generación de Valor</w:t>
-      </w:r>
-    </w:p>
-    <w:p>
-      <w:pPr>
-        <w:jc w:val="center"/>
-        <w:rPr>
-          <w:rFonts w:ascii="Times New Roman" w:hAnsi="Times New Roman" w:cs="Times New Roman"/>
-          <w:lang w:val="es-ES"/>
-        </w:rPr>
-      </w:pPr>
-      <w:r>
-        <w:rPr>
-          <w:rFonts w:ascii="Times New Roman" w:hAnsi="Times New Roman" w:cs="Times New Roman"/>
-          <w:lang w:val="es-ES"/>
-        </w:rPr>
-        <w:t xml:space="preserve">Link del video: </w:t>
-      </w:r>
-    </w:p>
-    <w:p>
-      <w:pPr>
-        <w:jc w:val="center"/>
-        <w:rPr>
-          <w:rFonts w:ascii="Times New Roman" w:hAnsi="Times New Roman" w:cs="Times New Roman"/>
-          <w:lang w:val="es-ES"/>
-        </w:rPr>
-      </w:pPr>
-      <w:r>
-        <w:rPr>
-          <w:rFonts w:ascii="Times New Roman" w:hAnsi="Times New Roman" w:cs="Times New Roman"/>
-          <w:lang w:val="es-ES"/>
-        </w:rPr>
-        <w:t xml:space="preserve">Link del GitHub: </w:t>
-      </w:r>
     </w:p>
     <w:p>
       <w:pPr>
@@ -4486,7 +4454,7 @@
                     </pic:cNvPicPr>
                   </pic:nvPicPr>
                   <pic:blipFill>
-                    <a:blip r:embed="rId6">
+                    <a:blip r:embed="rId7">
                       <a:extLst>
                         <a:ext uri="{28A0092B-C50C-407E-A947-70E740481C1C}">
                           <a14:useLocalDpi xmlns:a14="http://schemas.microsoft.com/office/drawing/2010/main" val="0"/>
@@ -4551,7 +4519,7 @@
                     </pic:cNvPicPr>
                   </pic:nvPicPr>
                   <pic:blipFill>
-                    <a:blip r:embed="rId7">
+                    <a:blip r:embed="rId8">
                       <a:extLst>
                         <a:ext uri="{28A0092B-C50C-407E-A947-70E740481C1C}">
                           <a14:useLocalDpi xmlns:a14="http://schemas.microsoft.com/office/drawing/2010/main" val="0"/>
@@ -4695,7 +4663,7 @@
                     </pic:cNvPicPr>
                   </pic:nvPicPr>
                   <pic:blipFill>
-                    <a:blip r:embed="rId8">
+                    <a:blip r:embed="rId9">
                       <a:extLst>
                         <a:ext uri="{28A0092B-C50C-407E-A947-70E740481C1C}">
                           <a14:useLocalDpi xmlns:a14="http://schemas.microsoft.com/office/drawing/2010/main" val="0"/>
@@ -7916,7 +7884,7 @@
                     </pic:cNvPicPr>
                   </pic:nvPicPr>
                   <pic:blipFill>
-                    <a:blip r:embed="rId9">
+                    <a:blip r:embed="rId10">
                       <a:extLst>
                         <a:ext uri="{28A0092B-C50C-407E-A947-70E740481C1C}">
                           <a14:useLocalDpi xmlns:a14="http://schemas.microsoft.com/office/drawing/2010/main" val="0"/>
@@ -8975,7 +8943,7 @@
                     <pic:cNvPicPr/>
                   </pic:nvPicPr>
                   <pic:blipFill>
-                    <a:blip r:embed="rId10"/>
+                    <a:blip r:embed="rId11"/>
                     <a:stretch>
                       <a:fillRect/>
                     </a:stretch>
@@ -9921,7 +9889,7 @@
                     <pic:cNvPicPr/>
                   </pic:nvPicPr>
                   <pic:blipFill>
-                    <a:blip r:embed="rId11"/>
+                    <a:blip r:embed="rId12"/>
                     <a:stretch>
                       <a:fillRect/>
                     </a:stretch>
@@ -10920,7 +10888,7 @@
                     <pic:cNvPicPr/>
                   </pic:nvPicPr>
                   <pic:blipFill>
-                    <a:blip r:embed="rId12"/>
+                    <a:blip r:embed="rId13"/>
                     <a:stretch>
                       <a:fillRect/>
                     </a:stretch>
@@ -11976,7 +11944,7 @@
                     <pic:cNvPicPr/>
                   </pic:nvPicPr>
                   <pic:blipFill>
-                    <a:blip r:embed="rId13"/>
+                    <a:blip r:embed="rId14"/>
                     <a:stretch>
                       <a:fillRect/>
                     </a:stretch>
@@ -12899,7 +12867,7 @@
                     <pic:cNvPicPr/>
                   </pic:nvPicPr>
                   <pic:blipFill>
-                    <a:blip r:embed="rId14"/>
+                    <a:blip r:embed="rId15"/>
                     <a:stretch>
                       <a:fillRect/>
                     </a:stretch>
@@ -13819,7 +13787,7 @@
                     <pic:cNvPicPr/>
                   </pic:nvPicPr>
                   <pic:blipFill>
-                    <a:blip r:embed="rId15"/>
+                    <a:blip r:embed="rId16"/>
                     <a:stretch>
                       <a:fillRect/>
                     </a:stretch>
@@ -14839,7 +14807,7 @@
                     <pic:cNvPicPr/>
                   </pic:nvPicPr>
                   <pic:blipFill>
-                    <a:blip r:embed="rId16"/>
+                    <a:blip r:embed="rId17"/>
                     <a:stretch>
                       <a:fillRect/>
                     </a:stretch>
@@ -15729,7 +15697,7 @@
                     <pic:cNvPicPr/>
                   </pic:nvPicPr>
                   <pic:blipFill>
-                    <a:blip r:embed="rId17"/>
+                    <a:blip r:embed="rId18"/>
                     <a:stretch>
                       <a:fillRect/>
                     </a:stretch>
@@ -15780,7 +15748,7 @@
                     <pic:cNvPicPr/>
                   </pic:nvPicPr>
                   <pic:blipFill>
-                    <a:blip r:embed="rId18"/>
+                    <a:blip r:embed="rId19"/>
                     <a:stretch>
                       <a:fillRect/>
                     </a:stretch>
@@ -36177,6 +36145,18 @@
       <w:u w:val="single"/>
     </w:rPr>
   </w:style>
+  <w:style w:type="character" w:styleId="Mencinsinresolver">
+    <w:name w:val="Unresolved Mention"/>
+    <w:basedOn w:val="Fuentedeprrafopredeter"/>
+    <w:uiPriority w:val="99"/>
+    <w:semiHidden/>
+    <w:unhideWhenUsed/>
+    <w:rsid w:val="00D40DB3"/>
+    <w:rPr>
+      <w:color w:val="605E5C"/>
+      <w:shd w:val="clear" w:color="auto" w:fill="E1DFDD"/>
+    </w:rPr>
+  </w:style>
 </w:styles>
 </file>
 

</xml_diff>